<commit_message>
Reduce the authorship to the two continuing students
One member has withdrawn from the group. The title page, the declaration
signature blocks and the document metadata now list Richard Yawlui and Addo
Foster Keteku only. The contents pages were regenerated and are unchanged at
33 pages.

Co-Authored-By: Claude Opus 5 <noreply@anthropic.com>
Claude-Session: https://claude.ai/code/session_01KdnyBG83t8M9V8xEFmMKQq
</commit_message>
<xml_diff>
--- a/docs/SAPTS_Project_Report_Chapters_1-3.docx
+++ b/docs/SAPTS_Project_Report_Chapters_1-3.docx
@@ -236,20 +236,6 @@
           <w:sz w:val="24"/>
           <w:szCs w:val="24"/>
         </w:rPr>
-        <w:t xml:space="preserve">Prince Baffour Awuah (4211230066)</w:t>
-      </w:r>
-    </w:p>
-    <w:p>
-      <w:pPr>
-        <w:spacing w:after="0" w:before="0" w:line="360" w:lineRule="auto"/>
-        <w:jc w:val="center"/>
-      </w:pPr>
-      <w:r>
-        <w:rPr>
-          <w:rFonts w:ascii="Times New Roman" w:cs="Times New Roman" w:eastAsia="Times New Roman" w:hAnsi="Times New Roman"/>
-          <w:sz w:val="24"/>
-          <w:szCs w:val="24"/>
-        </w:rPr>
         <w:t xml:space="preserve">Addo Foster Keteku (4211231161)</w:t>
       </w:r>
     </w:p>
@@ -521,180 +507,6 @@
                 <w:szCs w:val="24"/>
               </w:rPr>
               <w:t xml:space="preserve">4211231018</w:t>
-            </w:r>
-          </w:p>
-        </w:tc>
-        <w:tc>
-          <w:tcPr>
-            <w:tcW w:type="dxa" w:w="3721"/>
-            <w:tcBorders>
-              <w:top w:val="none" w:color="FFFFFF" w:sz="0"/>
-              <w:left w:val="none" w:color="FFFFFF" w:sz="0"/>
-              <w:bottom w:val="none" w:color="FFFFFF" w:sz="0"/>
-              <w:right w:val="none" w:color="FFFFFF" w:sz="0"/>
-            </w:tcBorders>
-            <w:tcMar>
-              <w:top w:type="dxa" w:w="20"/>
-              <w:left w:type="dxa" w:w="0"/>
-              <w:bottom w:type="dxa" w:w="20"/>
-              <w:right w:type="dxa" w:w="60"/>
-            </w:tcMar>
-          </w:tcPr>
-          <w:p>
-            <w:pPr>
-              <w:spacing w:after="0" w:line="360" w:lineRule="auto"/>
-            </w:pPr>
-            <w:r>
-              <w:rPr>
-                <w:rFonts w:ascii="Times New Roman" w:cs="Times New Roman" w:eastAsia="Times New Roman" w:hAnsi="Times New Roman"/>
-                <w:sz w:val="24"/>
-                <w:szCs w:val="24"/>
-              </w:rPr>
-              <w:t xml:space="preserve">DATE: …………………………….</w:t>
-            </w:r>
-          </w:p>
-        </w:tc>
-      </w:tr>
-    </w:tbl>
-    <w:p>
-      <w:pPr>
-        <w:spacing w:line="360" w:lineRule="auto"/>
-      </w:pPr>
-      <w:r>
-        <w:rPr>
-          <w:rFonts w:ascii="Times New Roman" w:cs="Times New Roman" w:eastAsia="Times New Roman" w:hAnsi="Times New Roman"/>
-          <w:sz w:val="24"/>
-          <w:szCs w:val="24"/>
-        </w:rPr>
-        <w:t xml:space="preserve"/>
-      </w:r>
-    </w:p>
-    <w:tbl>
-      <w:tblPr>
-        <w:tblW w:type="dxa" w:w="8221"/>
-        <w:tblBorders>
-          <w:top w:val="none" w:color="FFFFFF" w:sz="0"/>
-          <w:left w:val="none" w:color="FFFFFF" w:sz="0"/>
-          <w:bottom w:val="none" w:color="FFFFFF" w:sz="0"/>
-          <w:right w:val="none" w:color="FFFFFF" w:sz="0"/>
-          <w:insideH w:val="none" w:color="FFFFFF" w:sz="0"/>
-          <w:insideV w:val="none" w:color="FFFFFF" w:sz="0"/>
-        </w:tblBorders>
-      </w:tblPr>
-      <w:tblGrid>
-        <w:gridCol w:w="4500"/>
-        <w:gridCol w:w="3721"/>
-      </w:tblGrid>
-      <w:tr>
-        <w:tc>
-          <w:tcPr>
-            <w:tcW w:type="dxa" w:w="4500"/>
-            <w:tcBorders>
-              <w:top w:val="none" w:color="FFFFFF" w:sz="0"/>
-              <w:left w:val="none" w:color="FFFFFF" w:sz="0"/>
-              <w:bottom w:val="none" w:color="FFFFFF" w:sz="0"/>
-              <w:right w:val="none" w:color="FFFFFF" w:sz="0"/>
-            </w:tcBorders>
-            <w:tcMar>
-              <w:top w:type="dxa" w:w="20"/>
-              <w:left w:type="dxa" w:w="0"/>
-              <w:bottom w:type="dxa" w:w="20"/>
-              <w:right w:type="dxa" w:w="60"/>
-            </w:tcMar>
-          </w:tcPr>
-          <w:p>
-            <w:pPr>
-              <w:spacing w:after="0" w:line="360" w:lineRule="auto"/>
-            </w:pPr>
-            <w:r>
-              <w:rPr>
-                <w:rFonts w:ascii="Times New Roman" w:cs="Times New Roman" w:eastAsia="Times New Roman" w:hAnsi="Times New Roman"/>
-                <w:b/>
-                <w:bCs/>
-                <w:sz w:val="24"/>
-                <w:szCs w:val="24"/>
-              </w:rPr>
-              <w:t xml:space="preserve">AUTHOR: </w:t>
-            </w:r>
-            <w:r>
-              <w:rPr>
-                <w:rFonts w:ascii="Times New Roman" w:cs="Times New Roman" w:eastAsia="Times New Roman" w:hAnsi="Times New Roman"/>
-                <w:sz w:val="24"/>
-                <w:szCs w:val="24"/>
-              </w:rPr>
-              <w:t xml:space="preserve">Prince Baffour Awuah</w:t>
-            </w:r>
-          </w:p>
-        </w:tc>
-        <w:tc>
-          <w:tcPr>
-            <w:tcW w:type="dxa" w:w="3721"/>
-            <w:tcBorders>
-              <w:top w:val="none" w:color="FFFFFF" w:sz="0"/>
-              <w:left w:val="none" w:color="FFFFFF" w:sz="0"/>
-              <w:bottom w:val="none" w:color="FFFFFF" w:sz="0"/>
-              <w:right w:val="none" w:color="FFFFFF" w:sz="0"/>
-            </w:tcBorders>
-            <w:tcMar>
-              <w:top w:type="dxa" w:w="20"/>
-              <w:left w:type="dxa" w:w="0"/>
-              <w:bottom w:type="dxa" w:w="20"/>
-              <w:right w:type="dxa" w:w="60"/>
-            </w:tcMar>
-          </w:tcPr>
-          <w:p>
-            <w:pPr>
-              <w:spacing w:after="0" w:line="360" w:lineRule="auto"/>
-            </w:pPr>
-            <w:r>
-              <w:rPr>
-                <w:rFonts w:ascii="Times New Roman" w:cs="Times New Roman" w:eastAsia="Times New Roman" w:hAnsi="Times New Roman"/>
-                <w:sz w:val="24"/>
-                <w:szCs w:val="24"/>
-              </w:rPr>
-              <w:t xml:space="preserve">SIGNATURE ....................................</w:t>
-            </w:r>
-          </w:p>
-        </w:tc>
-      </w:tr>
-      <w:tr>
-        <w:tc>
-          <w:tcPr>
-            <w:tcW w:type="dxa" w:w="4500"/>
-            <w:tcBorders>
-              <w:top w:val="none" w:color="FFFFFF" w:sz="0"/>
-              <w:left w:val="none" w:color="FFFFFF" w:sz="0"/>
-              <w:bottom w:val="none" w:color="FFFFFF" w:sz="0"/>
-              <w:right w:val="none" w:color="FFFFFF" w:sz="0"/>
-            </w:tcBorders>
-            <w:tcMar>
-              <w:top w:type="dxa" w:w="20"/>
-              <w:left w:type="dxa" w:w="0"/>
-              <w:bottom w:type="dxa" w:w="20"/>
-              <w:right w:type="dxa" w:w="60"/>
-            </w:tcMar>
-          </w:tcPr>
-          <w:p>
-            <w:pPr>
-              <w:spacing w:after="0" w:line="360" w:lineRule="auto"/>
-            </w:pPr>
-            <w:r>
-              <w:rPr>
-                <w:rFonts w:ascii="Times New Roman" w:cs="Times New Roman" w:eastAsia="Times New Roman" w:hAnsi="Times New Roman"/>
-                <w:b/>
-                <w:bCs/>
-                <w:sz w:val="24"/>
-                <w:szCs w:val="24"/>
-              </w:rPr>
-              <w:t xml:space="preserve">STUDENT ID: </w:t>
-            </w:r>
-            <w:r>
-              <w:rPr>
-                <w:rFonts w:ascii="Times New Roman" w:cs="Times New Roman" w:eastAsia="Times New Roman" w:hAnsi="Times New Roman"/>
-                <w:sz w:val="24"/>
-                <w:szCs w:val="24"/>
-              </w:rPr>
-              <w:t xml:space="preserve">4211230066</w:t>
             </w:r>
           </w:p>
         </w:tc>

</xml_diff>